<commit_message>
Limpieza del repositorio y actualización del sistema
</commit_message>
<xml_diff>
--- a/Casos de Uso/CU-00 General del Sistema V1.0.docx
+++ b/Casos de Uso/CU-00 General del Sistema V1.0.docx
@@ -112,47 +112,18 @@
           <w:bCs/>
           <w:sz w:val="28"/>
           <w:szCs w:val="28"/>
+          <w:lang w:val="es-ES"/>
         </w:rPr>
       </w:pPr>
-      <w:proofErr w:type="spellStart"/>
       <w:r>
         <w:rPr>
           <w:b/>
           <w:bCs/>
           <w:sz w:val="28"/>
           <w:szCs w:val="28"/>
-        </w:rPr>
-        <w:t>Fecha</w:t>
-      </w:r>
-      <w:proofErr w:type="spellEnd"/>
-      <w:r>
-        <w:rPr>
-          <w:b/>
-          <w:bCs/>
-          <w:sz w:val="28"/>
-          <w:szCs w:val="28"/>
-        </w:rPr>
-        <w:t xml:space="preserve"> </w:t>
-      </w:r>
-      <w:proofErr w:type="spellStart"/>
-      <w:r>
-        <w:rPr>
-          <w:b/>
-          <w:bCs/>
-          <w:sz w:val="28"/>
-          <w:szCs w:val="28"/>
-        </w:rPr>
-        <w:t>Elaboración</w:t>
-      </w:r>
-      <w:proofErr w:type="spellEnd"/>
-      <w:r>
-        <w:rPr>
-          <w:b/>
-          <w:bCs/>
-          <w:sz w:val="28"/>
-          <w:szCs w:val="28"/>
-        </w:rPr>
-        <w:t xml:space="preserve"> 20/07/2026 </w:t>
+          <w:lang w:val="es-ES"/>
+        </w:rPr>
+        <w:t xml:space="preserve">Fecha Elaboración 20/07/2026 </w:t>
       </w:r>
     </w:p>
     <w:p>
@@ -163,6 +134,7 @@
           <w:bCs/>
           <w:sz w:val="36"/>
           <w:szCs w:val="36"/>
+          <w:lang w:val="es-ES"/>
         </w:rPr>
       </w:pPr>
     </w:p>
@@ -174,6 +146,7 @@
           <w:bCs/>
           <w:sz w:val="36"/>
           <w:szCs w:val="36"/>
+          <w:lang w:val="es-ES"/>
         </w:rPr>
       </w:pPr>
     </w:p>
@@ -1939,148 +1912,28 @@
         <w:rPr>
           <w:lang w:val="es-ES"/>
         </w:rPr>
-        <w:t xml:space="preserve">. Usuario Agente de Atención </w:t>
+        <w:t xml:space="preserve">. Usuario </w:t>
       </w:r>
       <w:r>
         <w:rPr>
+          <w:lang w:val="es-ES"/>
+        </w:rPr>
+        <w:t>interno</w:t>
+      </w:r>
+      <w:r>
+        <w:rPr>
+          <w:lang w:val="es-ES"/>
+        </w:rPr>
+        <w:t xml:space="preserve"> </w:t>
+      </w:r>
+      <w:r>
+        <w:rPr>
           <w:b/>
           <w:bCs/>
           <w:lang w:val="es-ES"/>
         </w:rPr>
         <w:t>RN01.</w:t>
       </w:r>
-    </w:p>
-    <w:p>
-      <w:pPr>
-        <w:spacing w:after="40" w:line="252" w:lineRule="auto"/>
-        <w:ind w:left="1440"/>
-        <w:rPr>
-          <w:lang w:val="es-ES"/>
-        </w:rPr>
-      </w:pPr>
-      <w:r>
-        <w:rPr>
-          <w:lang w:val="es-ES"/>
-        </w:rPr>
-        <w:t>2.1.</w:t>
-      </w:r>
-      <w:r>
-        <w:rPr>
-          <w:lang w:val="es-ES"/>
-        </w:rPr>
-        <w:t>3</w:t>
-      </w:r>
-      <w:r>
-        <w:rPr>
-          <w:lang w:val="es-ES"/>
-        </w:rPr>
-        <w:t xml:space="preserve">. Usuario Supervisor </w:t>
-      </w:r>
-      <w:r>
-        <w:rPr>
-          <w:b/>
-          <w:bCs/>
-          <w:lang w:val="es-ES"/>
-        </w:rPr>
-        <w:t>RN01</w:t>
-      </w:r>
-      <w:r>
-        <w:rPr>
-          <w:lang w:val="es-ES"/>
-        </w:rPr>
-        <w:t>.</w:t>
-      </w:r>
-    </w:p>
-    <w:p>
-      <w:pPr>
-        <w:spacing w:after="40" w:line="252" w:lineRule="auto"/>
-        <w:ind w:left="1440"/>
-        <w:rPr>
-          <w:lang w:val="es-ES"/>
-        </w:rPr>
-      </w:pPr>
-      <w:r>
-        <w:rPr>
-          <w:lang w:val="es-ES"/>
-        </w:rPr>
-        <w:t>2.1.</w:t>
-      </w:r>
-      <w:r>
-        <w:rPr>
-          <w:lang w:val="es-ES"/>
-        </w:rPr>
-        <w:t>4</w:t>
-      </w:r>
-      <w:r>
-        <w:rPr>
-          <w:lang w:val="es-ES"/>
-        </w:rPr>
-        <w:t xml:space="preserve">. Usuario Administrador </w:t>
-      </w:r>
-      <w:r>
-        <w:rPr>
-          <w:b/>
-          <w:bCs/>
-          <w:lang w:val="es-ES"/>
-        </w:rPr>
-        <w:t>RN01</w:t>
-      </w:r>
-      <w:r>
-        <w:rPr>
-          <w:lang w:val="es-ES"/>
-        </w:rPr>
-        <w:t>.</w:t>
-      </w:r>
-    </w:p>
-    <w:p>
-      <w:pPr>
-        <w:spacing w:after="40" w:line="252" w:lineRule="auto"/>
-        <w:ind w:left="1440"/>
-        <w:rPr>
-          <w:lang w:val="es-ES"/>
-        </w:rPr>
-      </w:pPr>
-      <w:r>
-        <w:rPr>
-          <w:lang w:val="es-ES"/>
-        </w:rPr>
-        <w:t>2.1.</w:t>
-      </w:r>
-      <w:r>
-        <w:rPr>
-          <w:lang w:val="es-ES"/>
-        </w:rPr>
-        <w:t>5</w:t>
-      </w:r>
-      <w:r>
-        <w:rPr>
-          <w:lang w:val="es-ES"/>
-        </w:rPr>
-        <w:t xml:space="preserve">. Usuario Auditor </w:t>
-      </w:r>
-      <w:r>
-        <w:rPr>
-          <w:b/>
-          <w:bCs/>
-          <w:lang w:val="es-ES"/>
-        </w:rPr>
-        <w:t>RN01</w:t>
-      </w:r>
-      <w:r>
-        <w:rPr>
-          <w:lang w:val="es-ES"/>
-        </w:rPr>
-        <w:t>.</w:t>
-      </w:r>
-    </w:p>
-    <w:p>
-      <w:pPr>
-        <w:spacing w:after="40" w:line="252" w:lineRule="auto"/>
-        <w:ind w:left="1440"/>
-        <w:rPr>
-          <w:lang w:val="es-ES"/>
-        </w:rPr>
-      </w:pPr>
     </w:p>
     <w:p>
       <w:pPr>
@@ -2242,7 +2095,19 @@
         <w:rPr>
           <w:lang w:val="es-ES"/>
         </w:rPr>
-        <w:t>2. El sistema identifica si el actor utilizará el portal público o el módulo interno.</w:t>
+        <w:t xml:space="preserve">2. </w:t>
+      </w:r>
+      <w:r>
+        <w:rPr>
+          <w:lang w:val="es-ES"/>
+        </w:rPr>
+        <w:t xml:space="preserve">El sistema </w:t>
+      </w:r>
+      <w:r>
+        <w:rPr>
+          <w:lang w:val="es-ES"/>
+        </w:rPr>
+        <w:t>muestra “Registrar una queja”, “Consultar mi caso”, “Iniciar Sesión”.</w:t>
       </w:r>
     </w:p>
     <w:p>
@@ -2257,7 +2122,25 @@
         <w:rPr>
           <w:lang w:val="es-ES"/>
         </w:rPr>
-        <w:t xml:space="preserve">3. Cuando el actor es un usuario interno, el sistema invoca el </w:t>
+        <w:t>3. Cuando el actor es un usuario interno</w:t>
+      </w:r>
+      <w:r>
+        <w:rPr>
+          <w:lang w:val="es-ES"/>
+        </w:rPr>
+        <w:t xml:space="preserve"> ingresa a</w:t>
+      </w:r>
+      <w:r>
+        <w:rPr>
+          <w:lang w:val="es-ES"/>
+        </w:rPr>
+        <w:t>l</w:t>
+      </w:r>
+      <w:r>
+        <w:rPr>
+          <w:lang w:val="es-ES"/>
+        </w:rPr>
+        <w:t xml:space="preserve"> </w:t>
       </w:r>
       <w:r>
         <w:rPr>
@@ -2317,6 +2200,8 @@
         <w:spacing w:after="40" w:line="252" w:lineRule="auto"/>
         <w:ind w:left="720"/>
         <w:rPr>
+          <w:b/>
+          <w:bCs/>
           <w:lang w:val="es-ES"/>
         </w:rPr>
       </w:pPr>
@@ -2324,98 +2209,13 @@
         <w:rPr>
           <w:lang w:val="es-ES"/>
         </w:rPr>
-        <w:t>6. Para el Cliente, el sistema muestra las opciones Registrar Caso, Consultar Estado y Adjuntar Evidencias.</w:t>
+        <w:t>6</w:t>
       </w:r>
-    </w:p>
-    <w:p>
-      <w:pPr>
-        <w:spacing w:after="40" w:line="252" w:lineRule="auto"/>
-        <w:ind w:left="720"/>
-        <w:rPr>
-          <w:lang w:val="es-ES"/>
-        </w:rPr>
-      </w:pPr>
       <w:r>
         <w:rPr>
           <w:lang w:val="es-ES"/>
         </w:rPr>
-        <w:t>7. Para el Agente de Atención, el sistema muestra las opciones Administrar Casos, Registrar Seguimiento y Adjuntar Evidencias.</w:t>
-      </w:r>
-    </w:p>
-    <w:p>
-      <w:pPr>
-        <w:spacing w:after="40" w:line="252" w:lineRule="auto"/>
-        <w:ind w:left="720"/>
-        <w:rPr>
-          <w:lang w:val="es-ES"/>
-        </w:rPr>
-      </w:pPr>
-      <w:r>
-        <w:rPr>
-          <w:lang w:val="es-ES"/>
-        </w:rPr>
-        <w:t xml:space="preserve">8. Para el Supervisor, el sistema muestra las opciones Administrar Casos, Asignar </w:t>
-      </w:r>
-      <w:proofErr w:type="gramStart"/>
-      <w:r>
-        <w:rPr>
-          <w:lang w:val="es-ES"/>
-        </w:rPr>
-        <w:t>Responsable</w:t>
-      </w:r>
-      <w:proofErr w:type="gramEnd"/>
-      <w:r>
-        <w:rPr>
-          <w:lang w:val="es-ES"/>
-        </w:rPr>
-        <w:t>, Cerrar Caso y Generar Reportes.</w:t>
-      </w:r>
-    </w:p>
-    <w:p>
-      <w:pPr>
-        <w:spacing w:after="40" w:line="252" w:lineRule="auto"/>
-        <w:ind w:left="720"/>
-        <w:rPr>
-          <w:lang w:val="es-ES"/>
-        </w:rPr>
-      </w:pPr>
-      <w:r>
-        <w:rPr>
-          <w:lang w:val="es-ES"/>
-        </w:rPr>
-        <w:t>9. Para el Administrador, el sistema muestra las opciones Administrar Usuarios, Administrar Roles y Permisos, Administrar Sucursales, Generar Reportes y Administrar Notificaciones.</w:t>
-      </w:r>
-    </w:p>
-    <w:p>
-      <w:pPr>
-        <w:spacing w:after="40" w:line="252" w:lineRule="auto"/>
-        <w:ind w:left="720"/>
-        <w:rPr>
-          <w:lang w:val="es-ES"/>
-        </w:rPr>
-      </w:pPr>
-      <w:r>
-        <w:rPr>
-          <w:lang w:val="es-ES"/>
-        </w:rPr>
-        <w:t>10. Para el Auditor, el sistema muestra las opciones Consultar Bitácora y Generar reportes de auditoría.</w:t>
-      </w:r>
-    </w:p>
-    <w:p>
-      <w:pPr>
-        <w:spacing w:after="40" w:line="252" w:lineRule="auto"/>
-        <w:ind w:left="720"/>
-        <w:rPr>
-          <w:b/>
-          <w:bCs/>
-          <w:lang w:val="es-ES"/>
-        </w:rPr>
-      </w:pPr>
-      <w:r>
-        <w:rPr>
-          <w:lang w:val="es-ES"/>
-        </w:rPr>
-        <w:t xml:space="preserve">11. El actor selecciona una opción del menú principal. </w:t>
+        <w:t xml:space="preserve">. El actor selecciona una opción del menú principal. </w:t>
       </w:r>
       <w:r>
         <w:rPr>
@@ -2438,7 +2238,13 @@
         <w:rPr>
           <w:lang w:val="es-ES"/>
         </w:rPr>
-        <w:t xml:space="preserve">12. El sistema valida que el actor tenga autorización para ejecutar la opción seleccionada. </w:t>
+        <w:t>7</w:t>
+      </w:r>
+      <w:r>
+        <w:rPr>
+          <w:lang w:val="es-ES"/>
+        </w:rPr>
+        <w:t xml:space="preserve">. El sistema valida que el actor tenga autorización para ejecutar la opción seleccionada. </w:t>
       </w:r>
       <w:r>
         <w:rPr>
@@ -2461,8 +2267,13 @@
         <w:rPr>
           <w:lang w:val="es-ES"/>
         </w:rPr>
-        <w:lastRenderedPageBreak/>
-        <w:t>13. El sistema invoca el Caso de Uso correspondiente.</w:t>
+        <w:t>8</w:t>
+      </w:r>
+      <w:r>
+        <w:rPr>
+          <w:lang w:val="es-ES"/>
+        </w:rPr>
+        <w:t>. El sistema invoca el Caso de Uso correspondiente.</w:t>
       </w:r>
     </w:p>
     <w:p>
@@ -2477,7 +2288,13 @@
         <w:rPr>
           <w:lang w:val="es-ES"/>
         </w:rPr>
-        <w:t>14. El actor completa la operación del módulo seleccionado.</w:t>
+        <w:t>9</w:t>
+      </w:r>
+      <w:r>
+        <w:rPr>
+          <w:lang w:val="es-ES"/>
+        </w:rPr>
+        <w:t>. El actor completa la operación del módulo seleccionado.</w:t>
       </w:r>
     </w:p>
     <w:p>
@@ -2492,7 +2309,13 @@
         <w:rPr>
           <w:lang w:val="es-ES"/>
         </w:rPr>
-        <w:t xml:space="preserve">15. El sistema registra en la bitácora las acciones que requieren trazabilidad. </w:t>
+        <w:t>10</w:t>
+      </w:r>
+      <w:r>
+        <w:rPr>
+          <w:lang w:val="es-ES"/>
+        </w:rPr>
+        <w:t xml:space="preserve">. El sistema registra en la bitácora las acciones que requieren trazabilidad. </w:t>
       </w:r>
       <w:r>
         <w:rPr>
@@ -2515,7 +2338,13 @@
         <w:rPr>
           <w:lang w:val="es-ES"/>
         </w:rPr>
-        <w:t>16. El sistema muestra el resultado de la operación y retorna a la bandeja principal.</w:t>
+        <w:t>11</w:t>
+      </w:r>
+      <w:r>
+        <w:rPr>
+          <w:lang w:val="es-ES"/>
+        </w:rPr>
+        <w:t>. El sistema muestra el resultado de la operación y retorna a la bandeja principal.</w:t>
       </w:r>
     </w:p>
     <w:p>
@@ -2530,7 +2359,19 @@
         <w:rPr>
           <w:lang w:val="es-ES"/>
         </w:rPr>
-        <w:t xml:space="preserve">17. El usuario puede seleccionar otra opción del sistema o cerrar sesión. </w:t>
+        <w:t>1</w:t>
+      </w:r>
+      <w:r>
+        <w:rPr>
+          <w:lang w:val="es-ES"/>
+        </w:rPr>
+        <w:t>2</w:t>
+      </w:r>
+      <w:r>
+        <w:rPr>
+          <w:lang w:val="es-ES"/>
+        </w:rPr>
+        <w:t xml:space="preserve">. El usuario puede seleccionar otra opción del sistema o cerrar sesión. </w:t>
       </w:r>
       <w:r>
         <w:rPr>
@@ -2553,8 +2394,56 @@
         <w:rPr>
           <w:lang w:val="es-ES"/>
         </w:rPr>
-        <w:t>18. Fin del Caso de Uso.</w:t>
+        <w:t>1</w:t>
       </w:r>
+      <w:r>
+        <w:rPr>
+          <w:lang w:val="es-ES"/>
+        </w:rPr>
+        <w:t>3</w:t>
+      </w:r>
+      <w:r>
+        <w:rPr>
+          <w:lang w:val="es-ES"/>
+        </w:rPr>
+        <w:t>. Fin del Caso de Uso.</w:t>
+      </w:r>
+    </w:p>
+    <w:p>
+      <w:pPr>
+        <w:spacing w:after="40" w:line="252" w:lineRule="auto"/>
+        <w:ind w:left="720"/>
+        <w:rPr>
+          <w:lang w:val="es-ES"/>
+        </w:rPr>
+      </w:pPr>
+    </w:p>
+    <w:p>
+      <w:pPr>
+        <w:spacing w:after="40" w:line="252" w:lineRule="auto"/>
+        <w:ind w:left="720"/>
+        <w:rPr>
+          <w:lang w:val="es-ES"/>
+        </w:rPr>
+      </w:pPr>
+    </w:p>
+    <w:p>
+      <w:pPr>
+        <w:spacing w:after="40" w:line="252" w:lineRule="auto"/>
+        <w:ind w:left="720"/>
+        <w:rPr>
+          <w:lang w:val="es-ES"/>
+        </w:rPr>
+      </w:pPr>
+    </w:p>
+    <w:p>
+      <w:pPr>
+        <w:spacing w:after="40" w:line="252" w:lineRule="auto"/>
+        <w:ind w:left="720"/>
+        <w:rPr>
+          <w:lang w:val="es-ES"/>
+        </w:rPr>
+      </w:pPr>
     </w:p>
     <w:p>
       <w:pPr>
@@ -2570,6 +2459,7 @@
           <w:sz w:val="27"/>
           <w:lang w:val="es-ES"/>
         </w:rPr>
+        <w:lastRenderedPageBreak/>
         <w:t>2.4. Flujos Alternos.</w:t>
       </w:r>
     </w:p>
@@ -2876,1167 +2766,21 @@
           <w:b/>
           <w:lang w:val="es-ES"/>
         </w:rPr>
-        <w:t>FA04: El usuario selecciona Administrar Casos</w:t>
-      </w:r>
-    </w:p>
-    <w:p>
-      <w:pPr>
-        <w:spacing w:after="40" w:line="252" w:lineRule="auto"/>
-        <w:ind w:left="1440"/>
-        <w:rPr>
-          <w:lang w:val="es-ES"/>
-        </w:rPr>
-      </w:pPr>
-      <w:r>
-        <w:rPr>
-          <w:lang w:val="es-ES"/>
-        </w:rPr>
-        <w:t xml:space="preserve">1. El sistema invoca el </w:t>
+        <w:t>FA</w:t>
       </w:r>
       <w:r>
         <w:rPr>
           <w:b/>
-          <w:bCs/>
-          <w:lang w:val="es-ES"/>
-        </w:rPr>
-        <w:t>CU-04 Administrar Casos.</w:t>
-      </w:r>
-    </w:p>
-    <w:p>
-      <w:pPr>
-        <w:spacing w:after="40" w:line="252" w:lineRule="auto"/>
-        <w:ind w:left="1440"/>
-        <w:rPr>
-          <w:lang w:val="es-ES"/>
-        </w:rPr>
-      </w:pPr>
-      <w:r>
-        <w:rPr>
-          <w:lang w:val="es-ES"/>
-        </w:rPr>
-        <w:t>2. El sistema presenta los filtros y la tabla de casos de acuerdo con el rol y la sucursal del usuario.</w:t>
-      </w:r>
-    </w:p>
-    <w:p>
-      <w:pPr>
-        <w:spacing w:after="40" w:line="252" w:lineRule="auto"/>
-        <w:ind w:left="1440"/>
-        <w:rPr>
-          <w:lang w:val="es-ES"/>
-        </w:rPr>
-      </w:pPr>
-      <w:r>
-        <w:rPr>
-          <w:lang w:val="es-ES"/>
-        </w:rPr>
-        <w:t>3. El usuario consulta el detalle o ejecuta una acción permitida.</w:t>
-      </w:r>
-    </w:p>
-    <w:p>
-      <w:pPr>
-        <w:spacing w:after="40" w:line="252" w:lineRule="auto"/>
-        <w:ind w:left="1440"/>
-        <w:rPr>
-          <w:lang w:val="es-ES"/>
-        </w:rPr>
-      </w:pPr>
-      <w:r>
-        <w:rPr>
-          <w:lang w:val="es-ES"/>
-        </w:rPr>
-        <w:t>4. Fin del flujo alterno.</w:t>
-      </w:r>
-    </w:p>
-    <w:p>
-      <w:pPr>
-        <w:keepNext/>
-        <w:spacing w:before="80" w:after="40" w:line="252" w:lineRule="auto"/>
-        <w:ind w:left="720"/>
-        <w:rPr>
-          <w:lang w:val="es-ES"/>
-        </w:rPr>
-      </w:pPr>
-      <w:r>
-        <w:rPr>
-          <w:b/>
-          <w:lang w:val="es-ES"/>
-        </w:rPr>
-        <w:t xml:space="preserve">FA05: El Supervisor selecciona Asignar </w:t>
-      </w:r>
-      <w:proofErr w:type="gramStart"/>
-      <w:r>
-        <w:rPr>
-          <w:b/>
-          <w:lang w:val="es-ES"/>
-        </w:rPr>
-        <w:t>Responsable</w:t>
-      </w:r>
-      <w:proofErr w:type="gramEnd"/>
-    </w:p>
-    <w:p>
-      <w:pPr>
-        <w:spacing w:after="40" w:line="252" w:lineRule="auto"/>
-        <w:ind w:left="1440"/>
-        <w:rPr>
-          <w:lang w:val="es-ES"/>
-        </w:rPr>
-      </w:pPr>
-      <w:r>
-        <w:rPr>
-          <w:lang w:val="es-ES"/>
-        </w:rPr>
-        <w:t xml:space="preserve">1. El sistema invoca el </w:t>
+          <w:lang w:val="es-ES"/>
+        </w:rPr>
+        <w:t>4</w:t>
       </w:r>
       <w:r>
         <w:rPr>
           <w:b/>
-          <w:bCs/>
-          <w:lang w:val="es-ES"/>
-        </w:rPr>
-        <w:t xml:space="preserve">CU-05 Asignar </w:t>
-      </w:r>
-      <w:proofErr w:type="gramStart"/>
-      <w:r>
-        <w:rPr>
-          <w:b/>
-          <w:bCs/>
-          <w:lang w:val="es-ES"/>
-        </w:rPr>
-        <w:t>Responsable</w:t>
-      </w:r>
-      <w:proofErr w:type="gramEnd"/>
-      <w:r>
-        <w:rPr>
-          <w:lang w:val="es-ES"/>
-        </w:rPr>
-        <w:t>.</w:t>
-      </w:r>
-    </w:p>
-    <w:p>
-      <w:pPr>
-        <w:spacing w:after="40" w:line="252" w:lineRule="auto"/>
-        <w:ind w:left="1440"/>
-        <w:rPr>
-          <w:lang w:val="es-ES"/>
-        </w:rPr>
-      </w:pPr>
-      <w:r>
-        <w:rPr>
-          <w:lang w:val="es-ES"/>
-        </w:rPr>
-        <w:t>2. El supervisor selecciona un caso y un responsable activo.</w:t>
-      </w:r>
-    </w:p>
-    <w:p>
-      <w:pPr>
-        <w:spacing w:after="40" w:line="252" w:lineRule="auto"/>
-        <w:ind w:left="1440"/>
-        <w:rPr>
-          <w:lang w:val="es-ES"/>
-        </w:rPr>
-      </w:pPr>
-      <w:r>
-        <w:rPr>
-          <w:lang w:val="es-ES"/>
-        </w:rPr>
-        <w:t>3. El sistema registra la asignación y genera una notificación</w:t>
-      </w:r>
-      <w:r>
-        <w:rPr>
-          <w:b/>
-          <w:bCs/>
-          <w:lang w:val="es-ES"/>
-        </w:rPr>
-        <w:t>. RN09 RN14.</w:t>
-      </w:r>
-    </w:p>
-    <w:p>
-      <w:pPr>
-        <w:spacing w:after="40" w:line="252" w:lineRule="auto"/>
-        <w:ind w:left="1440"/>
-        <w:rPr>
-          <w:lang w:val="es-ES"/>
-        </w:rPr>
-      </w:pPr>
-      <w:r>
-        <w:rPr>
-          <w:lang w:val="es-ES"/>
-        </w:rPr>
-        <w:t>4. Fin del flujo alterno.</w:t>
-      </w:r>
-    </w:p>
-    <w:p>
-      <w:pPr>
-        <w:keepNext/>
-        <w:spacing w:before="80" w:after="40" w:line="252" w:lineRule="auto"/>
-        <w:ind w:left="720"/>
-        <w:rPr>
-          <w:lang w:val="es-ES"/>
-        </w:rPr>
-      </w:pPr>
-      <w:r>
-        <w:rPr>
-          <w:b/>
-          <w:lang w:val="es-ES"/>
-        </w:rPr>
-        <w:t>FA06: El Agente selecciona Registrar Seguimiento</w:t>
-      </w:r>
-    </w:p>
-    <w:p>
-      <w:pPr>
-        <w:spacing w:after="40" w:line="252" w:lineRule="auto"/>
-        <w:ind w:left="1440"/>
-        <w:rPr>
-          <w:b/>
-          <w:bCs/>
-          <w:lang w:val="es-ES"/>
-        </w:rPr>
-      </w:pPr>
-      <w:r>
-        <w:rPr>
-          <w:lang w:val="es-ES"/>
-        </w:rPr>
-        <w:t xml:space="preserve">1. El sistema invoca el </w:t>
-      </w:r>
-      <w:r>
-        <w:rPr>
-          <w:b/>
-          <w:bCs/>
-          <w:lang w:val="es-ES"/>
-        </w:rPr>
-        <w:t>CU-06 Registrar Seguimiento.</w:t>
-      </w:r>
-    </w:p>
-    <w:p>
-      <w:pPr>
-        <w:spacing w:after="40" w:line="252" w:lineRule="auto"/>
-        <w:ind w:left="1440"/>
-        <w:rPr>
-          <w:lang w:val="es-ES"/>
-        </w:rPr>
-      </w:pPr>
-      <w:r>
-        <w:rPr>
-          <w:lang w:val="es-ES"/>
-        </w:rPr>
-        <w:t>2. El agente registra el comentario, el tipo de seguimiento y la visibilidad.</w:t>
-      </w:r>
-    </w:p>
-    <w:p>
-      <w:pPr>
-        <w:spacing w:after="40" w:line="252" w:lineRule="auto"/>
-        <w:ind w:left="1440"/>
-        <w:rPr>
-          <w:b/>
-          <w:bCs/>
-          <w:lang w:val="es-ES"/>
-        </w:rPr>
-      </w:pPr>
-      <w:r>
-        <w:rPr>
-          <w:lang w:val="es-ES"/>
-        </w:rPr>
-        <w:t xml:space="preserve">3. El sistema almacena la información y actualiza la bitácora. </w:t>
-      </w:r>
-      <w:r>
-        <w:rPr>
-          <w:b/>
-          <w:bCs/>
-          <w:lang w:val="es-ES"/>
-        </w:rPr>
-        <w:t>RN11 RN18.</w:t>
-      </w:r>
-    </w:p>
-    <w:p>
-      <w:pPr>
-        <w:spacing w:after="40" w:line="252" w:lineRule="auto"/>
-        <w:ind w:left="1440"/>
-        <w:rPr>
-          <w:lang w:val="es-ES"/>
-        </w:rPr>
-      </w:pPr>
-      <w:r>
-        <w:rPr>
-          <w:lang w:val="es-ES"/>
-        </w:rPr>
-        <w:t>4. Fin del flujo alterno.</w:t>
-      </w:r>
-    </w:p>
-    <w:p>
-      <w:pPr>
-        <w:keepNext/>
-        <w:spacing w:before="80" w:after="40" w:line="252" w:lineRule="auto"/>
-        <w:ind w:left="720"/>
-        <w:rPr>
-          <w:lang w:val="es-ES"/>
-        </w:rPr>
-      </w:pPr>
-      <w:r>
-        <w:rPr>
-          <w:b/>
-          <w:lang w:val="es-ES"/>
-        </w:rPr>
-        <w:t>FA07: El actor selecciona Adjuntar Evidencias</w:t>
-      </w:r>
-    </w:p>
-    <w:p>
-      <w:pPr>
-        <w:spacing w:after="40" w:line="252" w:lineRule="auto"/>
-        <w:ind w:left="1440"/>
-        <w:rPr>
-          <w:lang w:val="es-ES"/>
-        </w:rPr>
-      </w:pPr>
-      <w:r>
-        <w:rPr>
-          <w:lang w:val="es-ES"/>
-        </w:rPr>
-        <w:t xml:space="preserve">1. El sistema invoca el </w:t>
-      </w:r>
-      <w:r>
-        <w:rPr>
-          <w:b/>
-          <w:bCs/>
-          <w:lang w:val="es-ES"/>
-        </w:rPr>
-        <w:t>CU-07 Adjuntar Evidencias.</w:t>
-      </w:r>
-    </w:p>
-    <w:p>
-      <w:pPr>
-        <w:spacing w:after="40" w:line="252" w:lineRule="auto"/>
-        <w:ind w:left="1440"/>
-        <w:rPr>
-          <w:lang w:val="es-ES"/>
-        </w:rPr>
-      </w:pPr>
-      <w:r>
-        <w:rPr>
-          <w:lang w:val="es-ES"/>
-        </w:rPr>
-        <w:t xml:space="preserve">2. El sistema valida el formato, tamaño y cantidad de archivos. </w:t>
-      </w:r>
-      <w:r>
-        <w:rPr>
-          <w:b/>
-          <w:bCs/>
-          <w:lang w:val="es-ES"/>
-        </w:rPr>
-        <w:t>RN07.</w:t>
-      </w:r>
-    </w:p>
-    <w:p>
-      <w:pPr>
-        <w:spacing w:after="40" w:line="252" w:lineRule="auto"/>
-        <w:ind w:left="1440"/>
-        <w:rPr>
-          <w:lang w:val="es-ES"/>
-        </w:rPr>
-      </w:pPr>
-      <w:r>
-        <w:rPr>
-          <w:lang w:val="es-ES"/>
-        </w:rPr>
-        <w:t>3. El sistema almacena los documentos y registra la carga en la bitácora.</w:t>
-      </w:r>
-    </w:p>
-    <w:p>
-      <w:pPr>
-        <w:spacing w:after="40" w:line="252" w:lineRule="auto"/>
-        <w:ind w:left="1440"/>
-        <w:rPr>
-          <w:lang w:val="es-ES"/>
-        </w:rPr>
-      </w:pPr>
-      <w:r>
-        <w:rPr>
-          <w:lang w:val="es-ES"/>
-        </w:rPr>
-        <w:t>4. Fin del flujo alterno.</w:t>
-      </w:r>
-    </w:p>
-    <w:p>
-      <w:pPr>
-        <w:spacing w:after="40" w:line="252" w:lineRule="auto"/>
-        <w:ind w:left="1440"/>
-        <w:rPr>
-          <w:lang w:val="es-ES"/>
-        </w:rPr>
-      </w:pPr>
-    </w:p>
-    <w:p>
-      <w:pPr>
-        <w:spacing w:after="40" w:line="252" w:lineRule="auto"/>
-        <w:ind w:left="1440"/>
-        <w:rPr>
-          <w:lang w:val="es-ES"/>
-        </w:rPr>
-      </w:pPr>
-    </w:p>
-    <w:p>
-      <w:pPr>
-        <w:spacing w:after="40" w:line="252" w:lineRule="auto"/>
-        <w:ind w:left="1440"/>
-        <w:rPr>
-          <w:lang w:val="es-ES"/>
-        </w:rPr>
-      </w:pPr>
-    </w:p>
-    <w:p>
-      <w:pPr>
-        <w:keepNext/>
-        <w:spacing w:before="80" w:after="40" w:line="252" w:lineRule="auto"/>
-        <w:ind w:left="720"/>
-        <w:rPr>
-          <w:lang w:val="es-ES"/>
-        </w:rPr>
-      </w:pPr>
-      <w:r>
-        <w:rPr>
-          <w:b/>
-          <w:lang w:val="es-ES"/>
-        </w:rPr>
-        <w:lastRenderedPageBreak/>
-        <w:t>FA08: El Supervisor selecciona Cerrar Caso</w:t>
-      </w:r>
-    </w:p>
-    <w:p>
-      <w:pPr>
-        <w:spacing w:after="40" w:line="252" w:lineRule="auto"/>
-        <w:ind w:left="1440"/>
-        <w:rPr>
-          <w:lang w:val="es-ES"/>
-        </w:rPr>
-      </w:pPr>
-      <w:r>
-        <w:rPr>
-          <w:lang w:val="es-ES"/>
-        </w:rPr>
-        <w:t xml:space="preserve">1. El sistema invoca el </w:t>
-      </w:r>
-      <w:r>
-        <w:rPr>
-          <w:b/>
-          <w:bCs/>
-          <w:lang w:val="es-ES"/>
-        </w:rPr>
-        <w:t>CU-08 Cerrar Caso</w:t>
-      </w:r>
-      <w:r>
-        <w:rPr>
-          <w:lang w:val="es-ES"/>
-        </w:rPr>
-        <w:t>.</w:t>
-      </w:r>
-    </w:p>
-    <w:p>
-      <w:pPr>
-        <w:spacing w:after="40" w:line="252" w:lineRule="auto"/>
-        <w:ind w:left="1440"/>
-        <w:rPr>
-          <w:lang w:val="es-ES"/>
-        </w:rPr>
-      </w:pPr>
-      <w:r>
-        <w:rPr>
-          <w:lang w:val="es-ES"/>
-        </w:rPr>
-        <w:t xml:space="preserve">2. El sistema valida que el caso se encuentre en un estado que permita el cierre. </w:t>
-      </w:r>
-      <w:r>
-        <w:rPr>
-          <w:b/>
-          <w:bCs/>
-          <w:lang w:val="es-ES"/>
-        </w:rPr>
-        <w:t>RN10 RN12.</w:t>
-      </w:r>
-    </w:p>
-    <w:p>
-      <w:pPr>
-        <w:spacing w:after="40" w:line="252" w:lineRule="auto"/>
-        <w:ind w:left="1440"/>
-        <w:rPr>
-          <w:lang w:val="es-ES"/>
-        </w:rPr>
-      </w:pPr>
-      <w:r>
-        <w:rPr>
-          <w:lang w:val="es-ES"/>
-        </w:rPr>
-        <w:t>3. El supervisor registra la resolución final y confirma el cierre.</w:t>
-      </w:r>
-    </w:p>
-    <w:p>
-      <w:pPr>
-        <w:spacing w:after="40" w:line="252" w:lineRule="auto"/>
-        <w:ind w:left="720" w:firstLine="720"/>
-        <w:rPr>
-          <w:lang w:val="es-ES"/>
-        </w:rPr>
-      </w:pPr>
-      <w:r>
-        <w:rPr>
-          <w:lang w:val="es-ES"/>
-        </w:rPr>
-        <w:t>4. Fin del flujo alterno.</w:t>
-      </w:r>
-    </w:p>
-    <w:p>
-      <w:pPr>
-        <w:keepNext/>
-        <w:spacing w:before="80" w:after="40" w:line="252" w:lineRule="auto"/>
-        <w:ind w:left="720"/>
-        <w:rPr>
-          <w:lang w:val="es-ES"/>
-        </w:rPr>
-      </w:pPr>
-      <w:r>
-        <w:rPr>
-          <w:b/>
-          <w:lang w:val="es-ES"/>
-        </w:rPr>
-        <w:t>FA09: El Administrador selecciona Administrar Usuarios</w:t>
-      </w:r>
-    </w:p>
-    <w:p>
-      <w:pPr>
-        <w:spacing w:after="40" w:line="252" w:lineRule="auto"/>
-        <w:ind w:left="1440"/>
-        <w:rPr>
-          <w:b/>
-          <w:bCs/>
-          <w:lang w:val="es-ES"/>
-        </w:rPr>
-      </w:pPr>
-      <w:r>
-        <w:rPr>
-          <w:lang w:val="es-ES"/>
-        </w:rPr>
-        <w:t xml:space="preserve">1. El sistema invoca el </w:t>
-      </w:r>
-      <w:r>
-        <w:rPr>
-          <w:b/>
-          <w:bCs/>
-          <w:lang w:val="es-ES"/>
-        </w:rPr>
-        <w:t>CU-09 Administrar Usuarios.</w:t>
-      </w:r>
-    </w:p>
-    <w:p>
-      <w:pPr>
-        <w:spacing w:after="40" w:line="252" w:lineRule="auto"/>
-        <w:ind w:left="1440"/>
-        <w:rPr>
-          <w:lang w:val="es-ES"/>
-        </w:rPr>
-      </w:pPr>
-      <w:r>
-        <w:rPr>
-          <w:lang w:val="es-ES"/>
-        </w:rPr>
-        <w:t>2. El administrador crea, consulta, actualiza o cambia el estado de un usuario.</w:t>
-      </w:r>
-    </w:p>
-    <w:p>
-      <w:pPr>
-        <w:spacing w:after="40" w:line="252" w:lineRule="auto"/>
-        <w:ind w:left="1440"/>
-        <w:rPr>
-          <w:lang w:val="es-ES"/>
-        </w:rPr>
-      </w:pPr>
-      <w:r>
-        <w:rPr>
-          <w:lang w:val="es-ES"/>
-        </w:rPr>
-        <w:t>3. El sistema registra la acción en la bitácora de auditoría.</w:t>
-      </w:r>
-    </w:p>
-    <w:p>
-      <w:pPr>
-        <w:spacing w:after="40" w:line="252" w:lineRule="auto"/>
-        <w:ind w:left="1440"/>
-        <w:rPr>
-          <w:lang w:val="es-ES"/>
-        </w:rPr>
-      </w:pPr>
-      <w:r>
-        <w:rPr>
-          <w:lang w:val="es-ES"/>
-        </w:rPr>
-        <w:t>4. Fin del flujo alterno.</w:t>
-      </w:r>
-    </w:p>
-    <w:p>
-      <w:pPr>
-        <w:keepNext/>
-        <w:spacing w:before="80" w:after="40" w:line="252" w:lineRule="auto"/>
-        <w:ind w:left="720"/>
-        <w:rPr>
-          <w:lang w:val="es-ES"/>
-        </w:rPr>
-      </w:pPr>
-      <w:r>
-        <w:rPr>
-          <w:b/>
-          <w:lang w:val="es-ES"/>
-        </w:rPr>
-        <w:t>FA10: El Administrador selecciona Administrar Roles y Permisos</w:t>
-      </w:r>
-    </w:p>
-    <w:p>
-      <w:pPr>
-        <w:spacing w:after="40" w:line="252" w:lineRule="auto"/>
-        <w:ind w:left="1440"/>
-        <w:rPr>
-          <w:lang w:val="es-ES"/>
-        </w:rPr>
-      </w:pPr>
-      <w:r>
-        <w:rPr>
-          <w:lang w:val="es-ES"/>
-        </w:rPr>
-        <w:t xml:space="preserve">1. El sistema invoca el </w:t>
-      </w:r>
-      <w:r>
-        <w:rPr>
-          <w:b/>
-          <w:bCs/>
-          <w:lang w:val="es-ES"/>
-        </w:rPr>
-        <w:t>CU-10 Administrar Roles y Permisos.</w:t>
-      </w:r>
-    </w:p>
-    <w:p>
-      <w:pPr>
-        <w:spacing w:after="40" w:line="252" w:lineRule="auto"/>
-        <w:ind w:left="1440"/>
-        <w:rPr>
-          <w:lang w:val="es-ES"/>
-        </w:rPr>
-      </w:pPr>
-      <w:r>
-        <w:rPr>
-          <w:lang w:val="es-ES"/>
-        </w:rPr>
-        <w:t>2. El administrador consulta o actualiza las autorizaciones disponibles para cada rol.</w:t>
-      </w:r>
-    </w:p>
-    <w:p>
-      <w:pPr>
-        <w:spacing w:after="40" w:line="252" w:lineRule="auto"/>
-        <w:ind w:left="1440"/>
-        <w:rPr>
-          <w:lang w:val="es-ES"/>
-        </w:rPr>
-      </w:pPr>
-      <w:r>
-        <w:rPr>
-          <w:lang w:val="es-ES"/>
-        </w:rPr>
-        <w:t>3. El sistema registra los cambios de permisos en la bitácora.</w:t>
-      </w:r>
-    </w:p>
-    <w:p>
-      <w:pPr>
-        <w:spacing w:after="40" w:line="252" w:lineRule="auto"/>
-        <w:ind w:left="1440"/>
-        <w:rPr>
-          <w:lang w:val="es-ES"/>
-        </w:rPr>
-      </w:pPr>
-      <w:r>
-        <w:rPr>
-          <w:lang w:val="es-ES"/>
-        </w:rPr>
-        <w:t>4. Fin del flujo alterno.</w:t>
-      </w:r>
-    </w:p>
-    <w:p>
-      <w:pPr>
-        <w:keepNext/>
-        <w:spacing w:before="80" w:after="40" w:line="252" w:lineRule="auto"/>
-        <w:ind w:left="720"/>
-        <w:rPr>
-          <w:lang w:val="es-ES"/>
-        </w:rPr>
-      </w:pPr>
-      <w:r>
-        <w:rPr>
-          <w:b/>
-          <w:lang w:val="es-ES"/>
-        </w:rPr>
-        <w:t>FA11: El Administrador selecciona Administrar Sucursales</w:t>
-      </w:r>
-    </w:p>
-    <w:p>
-      <w:pPr>
-        <w:spacing w:after="40" w:line="252" w:lineRule="auto"/>
-        <w:ind w:left="1440"/>
-        <w:rPr>
-          <w:b/>
-          <w:bCs/>
-          <w:lang w:val="es-ES"/>
-        </w:rPr>
-      </w:pPr>
-      <w:r>
-        <w:rPr>
-          <w:lang w:val="es-ES"/>
-        </w:rPr>
-        <w:t xml:space="preserve">1. El sistema invoca </w:t>
-      </w:r>
-      <w:r>
-        <w:rPr>
-          <w:b/>
-          <w:bCs/>
-          <w:lang w:val="es-ES"/>
-        </w:rPr>
-        <w:t>el CU-11 Administrar Sucursales.</w:t>
-      </w:r>
-    </w:p>
-    <w:p>
-      <w:pPr>
-        <w:spacing w:after="40" w:line="252" w:lineRule="auto"/>
-        <w:ind w:left="1440"/>
-        <w:rPr>
-          <w:lang w:val="es-ES"/>
-        </w:rPr>
-      </w:pPr>
-      <w:r>
-        <w:rPr>
-          <w:lang w:val="es-ES"/>
-        </w:rPr>
-        <w:t>2. El administrador registra, consulta, actualiza o cambia el estado de una sucursal.</w:t>
-      </w:r>
-    </w:p>
-    <w:p>
-      <w:pPr>
-        <w:spacing w:after="40" w:line="252" w:lineRule="auto"/>
-        <w:ind w:left="1440"/>
-        <w:rPr>
-          <w:lang w:val="es-ES"/>
-        </w:rPr>
-      </w:pPr>
-      <w:r>
-        <w:rPr>
-          <w:lang w:val="es-ES"/>
-        </w:rPr>
-        <w:t>3. El sistema valida los campos y registra la operación.</w:t>
-      </w:r>
-    </w:p>
-    <w:p>
-      <w:pPr>
-        <w:spacing w:after="40" w:line="252" w:lineRule="auto"/>
-        <w:ind w:left="1440"/>
-        <w:rPr>
-          <w:lang w:val="es-ES"/>
-        </w:rPr>
-      </w:pPr>
-      <w:r>
-        <w:rPr>
-          <w:lang w:val="es-ES"/>
-        </w:rPr>
-        <w:t>4. Fin del flujo alterno.</w:t>
-      </w:r>
-    </w:p>
-    <w:p>
-      <w:pPr>
-        <w:keepNext/>
-        <w:spacing w:before="80" w:after="40" w:line="252" w:lineRule="auto"/>
-        <w:ind w:left="720"/>
-        <w:rPr>
-          <w:lang w:val="es-ES"/>
-        </w:rPr>
-      </w:pPr>
-      <w:r>
-        <w:rPr>
-          <w:b/>
-          <w:lang w:val="es-ES"/>
-        </w:rPr>
-        <w:t>FA12: El usuario autorizado selecciona Generar Reportes</w:t>
-      </w:r>
-    </w:p>
-    <w:p>
-      <w:pPr>
-        <w:spacing w:after="40" w:line="252" w:lineRule="auto"/>
-        <w:ind w:left="1440"/>
-        <w:rPr>
-          <w:b/>
-          <w:bCs/>
-          <w:lang w:val="es-ES"/>
-        </w:rPr>
-      </w:pPr>
-      <w:r>
-        <w:rPr>
-          <w:lang w:val="es-ES"/>
-        </w:rPr>
-        <w:t xml:space="preserve">1. El sistema invoca el </w:t>
-      </w:r>
-      <w:r>
-        <w:rPr>
-          <w:b/>
-          <w:bCs/>
-          <w:lang w:val="es-ES"/>
-        </w:rPr>
-        <w:t>CU-12 Generar Reportes.</w:t>
-      </w:r>
-    </w:p>
-    <w:p>
-      <w:pPr>
-        <w:spacing w:after="40" w:line="252" w:lineRule="auto"/>
-        <w:ind w:left="1440"/>
-        <w:rPr>
-          <w:lang w:val="es-ES"/>
-        </w:rPr>
-      </w:pPr>
-      <w:r>
-        <w:rPr>
-          <w:lang w:val="es-ES"/>
-        </w:rPr>
-        <w:t xml:space="preserve">2. El usuario selecciona los filtros, el tipo de reporte y el formato de salida. </w:t>
-      </w:r>
-      <w:r>
-        <w:rPr>
-          <w:b/>
-          <w:bCs/>
-          <w:lang w:val="es-ES"/>
-        </w:rPr>
-        <w:t>RN17.</w:t>
-      </w:r>
-    </w:p>
-    <w:p>
-      <w:pPr>
-        <w:spacing w:after="40" w:line="252" w:lineRule="auto"/>
-        <w:ind w:left="1440"/>
-        <w:rPr>
-          <w:lang w:val="es-ES"/>
-        </w:rPr>
-      </w:pPr>
-      <w:r>
-        <w:rPr>
-          <w:lang w:val="es-ES"/>
-        </w:rPr>
-        <w:t>3. El sistema genera el reporte y registra la descarga cuando corresponda.</w:t>
-      </w:r>
-    </w:p>
-    <w:p>
-      <w:pPr>
-        <w:spacing w:after="40" w:line="252" w:lineRule="auto"/>
-        <w:ind w:left="1440"/>
-        <w:rPr>
-          <w:lang w:val="es-ES"/>
-        </w:rPr>
-      </w:pPr>
-      <w:r>
-        <w:rPr>
-          <w:lang w:val="es-ES"/>
-        </w:rPr>
-        <w:t>4. Fin del flujo alterno.</w:t>
-      </w:r>
-    </w:p>
-    <w:p>
-      <w:pPr>
-        <w:keepNext/>
-        <w:spacing w:before="80" w:after="40" w:line="252" w:lineRule="auto"/>
-        <w:ind w:left="720"/>
-        <w:rPr>
-          <w:lang w:val="es-ES"/>
-        </w:rPr>
-      </w:pPr>
-      <w:r>
-        <w:rPr>
-          <w:b/>
-          <w:lang w:val="es-ES"/>
-        </w:rPr>
-        <w:t>FA13: El Auditor selecciona Consultar Bitácora</w:t>
-      </w:r>
-    </w:p>
-    <w:p>
-      <w:pPr>
-        <w:spacing w:after="40" w:line="252" w:lineRule="auto"/>
-        <w:ind w:left="1440"/>
-        <w:rPr>
-          <w:lang w:val="es-ES"/>
-        </w:rPr>
-      </w:pPr>
-      <w:r>
-        <w:rPr>
-          <w:lang w:val="es-ES"/>
-        </w:rPr>
-        <w:t xml:space="preserve">1. El sistema invoca el </w:t>
-      </w:r>
-      <w:r>
-        <w:rPr>
-          <w:b/>
-          <w:bCs/>
-          <w:lang w:val="es-ES"/>
-        </w:rPr>
-        <w:t>CU-13 Consultar Bitácora de Auditoría.</w:t>
-      </w:r>
-    </w:p>
-    <w:p>
-      <w:pPr>
-        <w:spacing w:after="40" w:line="252" w:lineRule="auto"/>
-        <w:ind w:left="1440"/>
-        <w:rPr>
-          <w:lang w:val="es-ES"/>
-        </w:rPr>
-      </w:pPr>
-      <w:r>
-        <w:rPr>
-          <w:lang w:val="es-ES"/>
-        </w:rPr>
-        <w:t>2. El auditor selecciona los filtros de búsqueda permitidos.</w:t>
-      </w:r>
-    </w:p>
-    <w:p>
-      <w:pPr>
-        <w:spacing w:after="40" w:line="252" w:lineRule="auto"/>
-        <w:ind w:left="1440"/>
-        <w:rPr>
-          <w:b/>
-          <w:bCs/>
-          <w:lang w:val="es-ES"/>
-        </w:rPr>
-      </w:pPr>
-      <w:r>
-        <w:rPr>
-          <w:lang w:val="es-ES"/>
-        </w:rPr>
-        <w:t xml:space="preserve">3. El sistema muestra los eventos sin permitir modificación o eliminación. </w:t>
-      </w:r>
-      <w:r>
-        <w:rPr>
-          <w:b/>
-          <w:bCs/>
-          <w:lang w:val="es-ES"/>
-        </w:rPr>
-        <w:t>RN18 RN22.</w:t>
-      </w:r>
-    </w:p>
-    <w:p>
-      <w:pPr>
-        <w:spacing w:after="40" w:line="252" w:lineRule="auto"/>
-        <w:ind w:left="1440"/>
-        <w:rPr>
-          <w:lang w:val="es-ES"/>
-        </w:rPr>
-      </w:pPr>
-      <w:r>
-        <w:rPr>
-          <w:lang w:val="es-ES"/>
-        </w:rPr>
-        <w:t>4. Fin del flujo alterno.</w:t>
-      </w:r>
-    </w:p>
-    <w:p>
-      <w:pPr>
-        <w:keepNext/>
-        <w:spacing w:before="80" w:after="40" w:line="252" w:lineRule="auto"/>
-        <w:ind w:left="720"/>
-        <w:rPr>
-          <w:lang w:val="es-ES"/>
-        </w:rPr>
-      </w:pPr>
-      <w:r>
-        <w:rPr>
-          <w:b/>
-          <w:lang w:val="es-ES"/>
-        </w:rPr>
-        <w:t>FA14: El Administrador selecciona Administrar Notificaciones</w:t>
-      </w:r>
-    </w:p>
-    <w:p>
-      <w:pPr>
-        <w:spacing w:after="40" w:line="252" w:lineRule="auto"/>
-        <w:ind w:left="1440"/>
-        <w:rPr>
-          <w:lang w:val="es-ES"/>
-        </w:rPr>
-      </w:pPr>
-      <w:r>
-        <w:rPr>
-          <w:lang w:val="es-ES"/>
-        </w:rPr>
-        <w:t xml:space="preserve">1. El sistema invoca el </w:t>
-      </w:r>
-      <w:r>
-        <w:rPr>
-          <w:b/>
-          <w:bCs/>
-          <w:lang w:val="es-ES"/>
-        </w:rPr>
-        <w:t>CU-14 Administrar Notificaciones.</w:t>
-      </w:r>
-    </w:p>
-    <w:p>
-      <w:pPr>
-        <w:spacing w:after="40" w:line="252" w:lineRule="auto"/>
-        <w:ind w:left="1440"/>
-        <w:rPr>
-          <w:lang w:val="es-ES"/>
-        </w:rPr>
-      </w:pPr>
-      <w:r>
-        <w:rPr>
-          <w:lang w:val="es-ES"/>
-        </w:rPr>
-        <w:t>2. El administrador consulta o actualiza plantillas, canales y eventos de notificación.</w:t>
-      </w:r>
-    </w:p>
-    <w:p>
-      <w:pPr>
-        <w:spacing w:after="40" w:line="252" w:lineRule="auto"/>
-        <w:ind w:left="1440"/>
-        <w:rPr>
-          <w:lang w:val="es-ES"/>
-        </w:rPr>
-      </w:pPr>
-      <w:r>
-        <w:rPr>
-          <w:lang w:val="es-ES"/>
-        </w:rPr>
-        <w:t>3. El sistema registra la modificación realizada.</w:t>
-      </w:r>
-    </w:p>
-    <w:p>
-      <w:pPr>
-        <w:spacing w:after="40" w:line="252" w:lineRule="auto"/>
-        <w:ind w:left="1440"/>
-        <w:rPr>
-          <w:lang w:val="es-ES"/>
-        </w:rPr>
-      </w:pPr>
-      <w:r>
-        <w:rPr>
-          <w:lang w:val="es-ES"/>
-        </w:rPr>
-        <w:t>4. Fin del flujo alterno.</w:t>
-      </w:r>
-    </w:p>
-    <w:p>
-      <w:pPr>
-        <w:keepNext/>
-        <w:spacing w:before="80" w:after="40" w:line="252" w:lineRule="auto"/>
-        <w:ind w:firstLine="720"/>
-        <w:rPr>
-          <w:lang w:val="es-ES"/>
-        </w:rPr>
-      </w:pPr>
-      <w:r>
-        <w:rPr>
-          <w:b/>
-          <w:lang w:val="es-ES"/>
-        </w:rPr>
-        <w:t>FA15: El actor no cuenta con permisos</w:t>
-      </w:r>
-    </w:p>
-    <w:p>
-      <w:pPr>
-        <w:spacing w:after="40" w:line="252" w:lineRule="auto"/>
-        <w:ind w:left="1440"/>
-        <w:rPr>
-          <w:lang w:val="es-ES"/>
-        </w:rPr>
-      </w:pPr>
-      <w:r>
-        <w:rPr>
-          <w:lang w:val="es-ES"/>
-        </w:rPr>
-        <w:t>1. El sistema bloquea la operación seleccionada.</w:t>
-      </w:r>
-    </w:p>
-    <w:p>
-      <w:pPr>
-        <w:spacing w:after="40" w:line="252" w:lineRule="auto"/>
-        <w:ind w:left="1440"/>
-        <w:rPr>
-          <w:lang w:val="es-ES"/>
-        </w:rPr>
-      </w:pPr>
-      <w:r>
-        <w:rPr>
-          <w:lang w:val="es-ES"/>
-        </w:rPr>
-        <w:t xml:space="preserve">2. El sistema muestra el mensaje de error </w:t>
-      </w:r>
-      <w:r>
-        <w:rPr>
-          <w:b/>
-          <w:bCs/>
-          <w:lang w:val="es-ES"/>
-        </w:rPr>
-        <w:t>RN AN02</w:t>
-      </w:r>
-      <w:r>
-        <w:rPr>
-          <w:lang w:val="es-ES"/>
-        </w:rPr>
-        <w:t>: “No posee permisos para realizar esta acción”.</w:t>
-      </w:r>
-    </w:p>
-    <w:p>
-      <w:pPr>
-        <w:spacing w:after="40" w:line="252" w:lineRule="auto"/>
-        <w:ind w:left="1440"/>
-        <w:rPr>
-          <w:lang w:val="es-ES"/>
-        </w:rPr>
-      </w:pPr>
-      <w:r>
-        <w:rPr>
-          <w:lang w:val="es-ES"/>
-        </w:rPr>
-        <w:t>3. El sistema registra el intento en la bitácora cuando corresponda.</w:t>
-      </w:r>
-    </w:p>
-    <w:p>
-      <w:pPr>
-        <w:spacing w:after="40" w:line="252" w:lineRule="auto"/>
-        <w:ind w:left="1440"/>
-        <w:rPr>
-          <w:lang w:val="es-ES"/>
-        </w:rPr>
-      </w:pPr>
-      <w:r>
-        <w:rPr>
-          <w:lang w:val="es-ES"/>
-        </w:rPr>
-        <w:t>4. El sistema retorna a la bandeja principal.</w:t>
-      </w:r>
-    </w:p>
-    <w:p>
-      <w:pPr>
-        <w:spacing w:after="40" w:line="252" w:lineRule="auto"/>
-        <w:ind w:left="1440"/>
-        <w:rPr>
-          <w:lang w:val="es-ES"/>
-        </w:rPr>
-      </w:pPr>
-      <w:r>
-        <w:rPr>
-          <w:lang w:val="es-ES"/>
-        </w:rPr>
-        <w:t>5. Fin del flujo alterno.</w:t>
-      </w:r>
-    </w:p>
-    <w:p>
-      <w:pPr>
-        <w:keepNext/>
-        <w:spacing w:before="80" w:after="40" w:line="252" w:lineRule="auto"/>
-        <w:ind w:firstLine="720"/>
-        <w:rPr>
-          <w:lang w:val="es-ES"/>
-        </w:rPr>
-      </w:pPr>
-      <w:r>
-        <w:rPr>
-          <w:b/>
-          <w:lang w:val="es-ES"/>
-        </w:rPr>
-        <w:t>FA16: El usuario selecciona Cerrar Sesión</w:t>
+          <w:lang w:val="es-ES"/>
+        </w:rPr>
+        <w:t>: El usuario selecciona Cerrar Sesión</w:t>
       </w:r>
     </w:p>
     <w:p>
@@ -4128,8 +2872,21 @@
           <w:b/>
           <w:lang w:val="es-ES"/>
         </w:rPr>
-        <w:lastRenderedPageBreak/>
-        <w:t>FA17: El sistema no se encuentra disponible</w:t>
+        <w:t>FA</w:t>
+      </w:r>
+      <w:r>
+        <w:rPr>
+          <w:b/>
+          <w:lang w:val="es-ES"/>
+        </w:rPr>
+        <w:t>5</w:t>
+      </w:r>
+      <w:r>
+        <w:rPr>
+          <w:b/>
+          <w:lang w:val="es-ES"/>
+        </w:rPr>
+        <w:t>: El sistema no se encuentra disponible</w:t>
       </w:r>
     </w:p>
     <w:p>
@@ -4744,6 +3501,7 @@
               <w:rPr>
                 <w:sz w:val="16"/>
               </w:rPr>
+              <w:lastRenderedPageBreak/>
               <w:t>RNF07</w:t>
             </w:r>
           </w:p>
@@ -5759,7 +4517,6 @@
               <w:rPr>
                 <w:sz w:val="16"/>
               </w:rPr>
-              <w:lastRenderedPageBreak/>
               <w:t>CU-10</w:t>
             </w:r>
           </w:p>
@@ -6473,13 +5230,23 @@
       <w:pPr>
         <w:keepNext/>
         <w:spacing w:before="120" w:after="120" w:line="252" w:lineRule="auto"/>
+        <w:rPr>
+          <w:b/>
+          <w:sz w:val="27"/>
+        </w:rPr>
+      </w:pPr>
+    </w:p>
+    <w:p>
+      <w:pPr>
+        <w:keepNext/>
+        <w:spacing w:before="120" w:after="120" w:line="252" w:lineRule="auto"/>
       </w:pPr>
       <w:r>
         <w:rPr>
           <w:b/>
           <w:sz w:val="27"/>
         </w:rPr>
-        <w:t xml:space="preserve">5. </w:t>
+        <w:t>5. F</w:t>
       </w:r>
       <w:proofErr w:type="spellStart"/>
       <w:r>
@@ -6487,7 +5254,7 @@
           <w:b/>
           <w:sz w:val="27"/>
         </w:rPr>
-        <w:t>Firmas</w:t>
+        <w:t>irmas</w:t>
       </w:r>
       <w:proofErr w:type="spellEnd"/>
       <w:r>

</xml_diff>